<commit_message>
Actualiza contacto real: telefono +57 298 5298, correo lorisisabel22@gmail.com y CTAs de llamada
</commit_message>
<xml_diff>
--- a/docs/Propuesta_Landing_Coach_Basketball.docx
+++ b/docs/Propuesta_Landing_Coach_Basketball.docx
@@ -4790,7 +4790,7 @@
                 <w:color w:val="1A1D22"/>
                 <w:sz w:val="14"/>
               </w:rPr>
-              <w:t>02 ASESORÍA 1:1 — Para jugadoras que quieren dar el salto — Plan individual · 3 sesiones/semana · Seguimiento WhatsApp — Incluye: Diagnóstico 360° · Plan 12 semanas · Videoanálisis quincenal.</w:t>
+              <w:t>02 ASESORÍA 1:1 — Para jugadoras que quieren dar el salto — Plan individual · 3 sesiones/semana · Seguimiento telefónico — Incluye: Diagnóstico 360° · Plan 12 semanas · Videoanálisis quincenal.</w:t>
             </w:r>
           </w:p>
           <w:p>
@@ -5330,7 +5330,7 @@
                 <w:color w:val="1A1D22"/>
                 <w:sz w:val="14"/>
               </w:rPr>
-              <w:t>Formulario: Nombre · Email · WhatsApp · Perfil (Jugadora / Club o academia / Institución / Padre o madre) · Objetivo (textarea)</w:t>
+              <w:t>Formulario: Nombre · Email · Teléfono · Perfil (Jugadora / Club o academia / Institución / Padre o madre) · Objetivo (textarea)</w:t>
             </w:r>
           </w:p>
           <w:p>
@@ -5375,7 +5375,7 @@
                 <w:color w:val="1A1D22"/>
                 <w:sz w:val="14"/>
               </w:rPr>
-              <w:t>Tarjeta: «AGENDA DIRECTA» — WhatsApp directo, correo, base en Bogotá. «PRÓXIMA DISPONIBILIDAD: ABRIL — 3 CUPOS»</w:t>
+              <w:t>Tarjeta: «AGENDA DIRECTA» — llamada directa, correo, base en Bogotá. «PRÓXIMA DISPONIBILIDAD: ABRIL — 3 CUPOS»</w:t>
             </w:r>
           </w:p>
           <w:p>
@@ -16264,7 +16264,7 @@
                 <w:color w:val="1A1D22"/>
                 <w:sz w:val="15"/>
               </w:rPr>
-              <w:t>Nombre, Email, WhatsApp, Perfil y Objetivo</w:t>
+              <w:t>Nombre, Email, Teléfono, Perfil y Objetivo</w:t>
             </w:r>
           </w:p>
         </w:tc>
@@ -16607,7 +16607,7 @@
                 <w:color w:val="1A1D22"/>
                 <w:sz w:val="15"/>
               </w:rPr>
-              <w:t>WhatsApp flotante permanente</w:t>
+              <w:t>Llamada directa flotante</w:t>
             </w:r>
           </w:p>
         </w:tc>
@@ -17166,7 +17166,7 @@
                 <w:color w:val="1A1D22"/>
                 <w:sz w:val="15"/>
               </w:rPr>
-              <w:t>WhatsApp</w:t>
+              <w:t>Teléfono / WhatsApp</w:t>
             </w:r>
           </w:p>
         </w:tc>
@@ -18013,7 +18013,7 @@
                 <w:color w:val="1A1D22"/>
                 <w:sz w:val="15"/>
               </w:rPr>
-              <w:t>whatsapp_click</w:t>
+              <w:t>phone_click</w:t>
             </w:r>
           </w:p>
         </w:tc>
@@ -18034,7 +18034,7 @@
                 <w:color w:val="1A1D22"/>
                 <w:sz w:val="15"/>
               </w:rPr>
-              <w:t>Clic en WhatsApp</w:t>
+              <w:t>Clic en «Llamar»</w:t>
             </w:r>
           </w:p>
         </w:tc>
@@ -18381,7 +18381,7 @@
                 <w:spacing w:val="22"/>
                 <w:sz w:val="13"/>
               </w:rPr>
-              <w:t>CLIC A WHATSAPP</w:t>
+              <w:t>CLIC A LLAMADA</w:t>
             </w:r>
           </w:p>
         </w:tc>
@@ -22701,7 +22701,7 @@
                 <w:color w:val="1A1D22"/>
                 <w:sz w:val="15"/>
               </w:rPr>
-              <w:t>Hosting, dominio, Instagram y WhatsApp</w:t>
+              <w:t>Hosting, dominio, Instagram y teléfono</w:t>
             </w:r>
           </w:p>
         </w:tc>
@@ -23123,7 +23123,7 @@
                 <w:color w:val="F4F1E9"/>
                 <w:sz w:val="17"/>
               </w:rPr>
-              <w:t>hola@gloriacelis.co</w:t>
+              <w:t>lorisisabel22@gmail.com</w:t>
             </w:r>
             <w:r>
               <w:rPr>
@@ -23133,17 +23133,7 @@
                 <w:color w:val="F4F1E9"/>
                 <w:sz w:val="17"/>
               </w:rPr>
-              <w:t xml:space="preserve">      ·      +57 310 000 0000</w:t>
-            </w:r>
-            <w:r>
-              <w:rPr>
-                <w:rFonts w:ascii="Inter" w:hAnsi="Inter" w:cs="Inter" w:eastAsia="Inter"/>
-                <w:b w:val="0"/>
-                <w:i w:val="0"/>
-                <w:color w:val="8E959E"/>
-                <w:sz w:val="17"/>
-              </w:rPr>
-              <w:t xml:space="preserve">      ·      @gloriacelis.coach</w:t>
+              <w:t xml:space="preserve">      ·      +57 298 5298</w:t>
             </w:r>
           </w:p>
         </w:tc>

</xml_diff>